<commit_message>
Add exploratory analysis zip file for March 9, 2026
</commit_message>
<xml_diff>
--- a/resultados_analise/4_Idosos_APENAS_Artrite/estatisticas.docx
+++ b/resultados_analise/4_Idosos_APENAS_Artrite/estatisticas.docx
@@ -66,7 +66,7 @@
           </w:tcPr>
           <w:p>
             <w:r>
-              <w:t>128</w:t>
+              <w:t>53</w:t>
             </w:r>
           </w:p>
         </w:tc>
@@ -88,7 +88,7 @@
           </w:tcPr>
           <w:p>
             <w:r>
-              <w:t>333</w:t>
+              <w:t>137</w:t>
             </w:r>
           </w:p>
         </w:tc>
@@ -110,7 +110,7 @@
           </w:tcPr>
           <w:p>
             <w:r>
-              <w:t>257</w:t>
+              <w:t>84</w:t>
             </w:r>
           </w:p>
         </w:tc>
@@ -132,7 +132,7 @@
           </w:tcPr>
           <w:p>
             <w:r>
-              <w:t>170</w:t>
+              <w:t>84</w:t>
             </w:r>
           </w:p>
         </w:tc>
@@ -154,7 +154,7 @@
           </w:tcPr>
           <w:p>
             <w:r>
-              <w:t>134</w:t>
+              <w:t>56</w:t>
             </w:r>
           </w:p>
         </w:tc>
@@ -216,7 +216,7 @@
           </w:tcPr>
           <w:p>
             <w:r>
-              <w:t>31</w:t>
+              <w:t>9</w:t>
             </w:r>
           </w:p>
         </w:tc>
@@ -238,7 +238,7 @@
           </w:tcPr>
           <w:p>
             <w:r>
-              <w:t>37</w:t>
+              <w:t>15</w:t>
             </w:r>
           </w:p>
         </w:tc>
@@ -260,7 +260,7 @@
           </w:tcPr>
           <w:p>
             <w:r>
-              <w:t>27</w:t>
+              <w:t>4</w:t>
             </w:r>
           </w:p>
         </w:tc>
@@ -282,7 +282,7 @@
           </w:tcPr>
           <w:p>
             <w:r>
-              <w:t>47</w:t>
+              <w:t>18</w:t>
             </w:r>
           </w:p>
         </w:tc>
@@ -304,7 +304,7 @@
           </w:tcPr>
           <w:p>
             <w:r>
-              <w:t>51</w:t>
+              <w:t>16</w:t>
             </w:r>
           </w:p>
         </w:tc>
@@ -326,7 +326,7 @@
           </w:tcPr>
           <w:p>
             <w:r>
-              <w:t>50</w:t>
+              <w:t>24</w:t>
             </w:r>
           </w:p>
         </w:tc>
@@ -348,7 +348,7 @@
           </w:tcPr>
           <w:p>
             <w:r>
-              <w:t>15</w:t>
+              <w:t>4</w:t>
             </w:r>
           </w:p>
         </w:tc>
@@ -370,7 +370,7 @@
           </w:tcPr>
           <w:p>
             <w:r>
-              <w:t>40</w:t>
+              <w:t>18</w:t>
             </w:r>
           </w:p>
         </w:tc>
@@ -392,7 +392,7 @@
           </w:tcPr>
           <w:p>
             <w:r>
-              <w:t>41</w:t>
+              <w:t>19</w:t>
             </w:r>
           </w:p>
         </w:tc>
@@ -414,7 +414,7 @@
           </w:tcPr>
           <w:p>
             <w:r>
-              <w:t>73</w:t>
+              <w:t>32</w:t>
             </w:r>
           </w:p>
         </w:tc>
@@ -436,7 +436,7 @@
           </w:tcPr>
           <w:p>
             <w:r>
-              <w:t>32</w:t>
+              <w:t>11</w:t>
             </w:r>
           </w:p>
         </w:tc>
@@ -458,7 +458,7 @@
           </w:tcPr>
           <w:p>
             <w:r>
-              <w:t>40</w:t>
+              <w:t>19</w:t>
             </w:r>
           </w:p>
         </w:tc>
@@ -480,7 +480,7 @@
           </w:tcPr>
           <w:p>
             <w:r>
-              <w:t>55</w:t>
+              <w:t>22</w:t>
             </w:r>
           </w:p>
         </w:tc>
@@ -502,7 +502,7 @@
           </w:tcPr>
           <w:p>
             <w:r>
-              <w:t>44</w:t>
+              <w:t>17</w:t>
             </w:r>
           </w:p>
         </w:tc>
@@ -524,7 +524,7 @@
           </w:tcPr>
           <w:p>
             <w:r>
-              <w:t>50</w:t>
+              <w:t>21</w:t>
             </w:r>
           </w:p>
         </w:tc>
@@ -546,7 +546,7 @@
           </w:tcPr>
           <w:p>
             <w:r>
-              <w:t>68</w:t>
+              <w:t>31</w:t>
             </w:r>
           </w:p>
         </w:tc>
@@ -568,7 +568,7 @@
           </w:tcPr>
           <w:p>
             <w:r>
-              <w:t>40</w:t>
+              <w:t>15</w:t>
             </w:r>
           </w:p>
         </w:tc>
@@ -590,7 +590,7 @@
           </w:tcPr>
           <w:p>
             <w:r>
-              <w:t>31</w:t>
+              <w:t>19</w:t>
             </w:r>
           </w:p>
         </w:tc>
@@ -612,7 +612,7 @@
           </w:tcPr>
           <w:p>
             <w:r>
-              <w:t>47</w:t>
+              <w:t>23</w:t>
             </w:r>
           </w:p>
         </w:tc>
@@ -634,7 +634,7 @@
           </w:tcPr>
           <w:p>
             <w:r>
-              <w:t>53</w:t>
+              <w:t>23</w:t>
             </w:r>
           </w:p>
         </w:tc>
@@ -656,7 +656,7 @@
           </w:tcPr>
           <w:p>
             <w:r>
-              <w:t>59</w:t>
+              <w:t>36</w:t>
             </w:r>
           </w:p>
         </w:tc>
@@ -678,7 +678,7 @@
           </w:tcPr>
           <w:p>
             <w:r>
-              <w:t>40</w:t>
+              <w:t>4</w:t>
             </w:r>
           </w:p>
         </w:tc>
@@ -700,7 +700,7 @@
           </w:tcPr>
           <w:p>
             <w:r>
-              <w:t>21</w:t>
+              <w:t>7</w:t>
             </w:r>
           </w:p>
         </w:tc>
@@ -722,7 +722,7 @@
           </w:tcPr>
           <w:p>
             <w:r>
-              <w:t>37</w:t>
+              <w:t>16</w:t>
             </w:r>
           </w:p>
         </w:tc>
@@ -744,7 +744,7 @@
           </w:tcPr>
           <w:p>
             <w:r>
-              <w:t>35</w:t>
+              <w:t>12</w:t>
             </w:r>
           </w:p>
         </w:tc>
@@ -766,7 +766,7 @@
           </w:tcPr>
           <w:p>
             <w:r>
-              <w:t>56</w:t>
+              <w:t>26</w:t>
             </w:r>
           </w:p>
         </w:tc>
@@ -788,7 +788,7 @@
           </w:tcPr>
           <w:p>
             <w:r>
-              <w:t>23</w:t>
+              <w:t>11</w:t>
             </w:r>
           </w:p>
         </w:tc>

</xml_diff>